<commit_message>
update format spd rampung
</commit_message>
<xml_diff>
--- a/public/spd-rampung-kwitansi-format.docx
+++ b/public/spd-rampung-kwitansi-format.docx
@@ -21,7 +21,7 @@
     </w:p>
     <w:tbl>
       <w:tblPr>
-        <w:tblW w:w="10597" w:type="dxa"/>
+        <w:tblW w:w="10723" w:type="dxa"/>
         <w:tblInd w:w="-459" w:type="dxa"/>
         <w:tblLook w:val="0000" w:firstRow="0" w:lastRow="0" w:firstColumn="0" w:lastColumn="0" w:noHBand="0" w:noVBand="0"/>
       </w:tblPr>
@@ -71,7 +71,7 @@
                 <w:szCs w:val="28"/>
               </w:rPr>
               <w:drawing>
-                <wp:anchor distT="0" distB="0" distL="114300" distR="114300" simplePos="0" relativeHeight="251658240" behindDoc="1" locked="0" layoutInCell="1" allowOverlap="1" wp14:anchorId="47336D93" wp14:editId="187271D9">
+                <wp:anchor distT="0" distB="0" distL="114300" distR="114300" simplePos="0" relativeHeight="251659264" behindDoc="1" locked="0" layoutInCell="1" allowOverlap="1" wp14:anchorId="47336D93" wp14:editId="187271D9">
                   <wp:simplePos x="0" y="0"/>
                   <wp:positionH relativeFrom="column">
                     <wp:posOffset>-2540</wp:posOffset>
@@ -217,7 +217,7 @@
               <mc:AlternateContent>
                 <mc:Choice Requires="wps">
                   <w:drawing>
-                    <wp:anchor distT="0" distB="0" distL="114300" distR="114300" simplePos="0" relativeHeight="251657216" behindDoc="0" locked="0" layoutInCell="1" allowOverlap="1" wp14:anchorId="5AFD348D" wp14:editId="7C16F99A">
+                    <wp:anchor distT="0" distB="0" distL="114300" distR="114300" simplePos="0" relativeHeight="251656192" behindDoc="0" locked="0" layoutInCell="1" allowOverlap="1" wp14:anchorId="5AFD348D" wp14:editId="7C16F99A">
                       <wp:simplePos x="0" y="0"/>
                       <wp:positionH relativeFrom="column">
                         <wp:posOffset>-31115</wp:posOffset>
@@ -405,7 +405,7 @@
                       <v:stroke joinstyle="miter"/>
                       <v:path gradientshapeok="t" o:connecttype="rect"/>
                     </v:shapetype>
-                    <v:shape id="Text Box 7" o:spid="_x0000_s1026" type="#_x0000_t202" style="position:absolute;margin-left:-2.45pt;margin-top:6.6pt;width:400.5pt;height:39.75pt;z-index:251657216;visibility:visible;mso-wrap-style:square;mso-width-percent:0;mso-height-percent:0;mso-wrap-distance-left:9pt;mso-wrap-distance-top:0;mso-wrap-distance-right:9pt;mso-wrap-distance-bottom:0;mso-position-horizontal:absolute;mso-position-horizontal-relative:text;mso-position-vertical:absolute;mso-position-vertical-relative:text;mso-width-percent:0;mso-height-percent:0;mso-width-relative:page;mso-height-relative:page;v-text-anchor:top" o:gfxdata="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" filled="f" stroked="f">
+                    <v:shape id="Text Box 7" o:spid="_x0000_s1026" type="#_x0000_t202" style="position:absolute;margin-left:-2.45pt;margin-top:6.6pt;width:400.5pt;height:39.75pt;z-index:251656192;visibility:visible;mso-wrap-style:square;mso-width-percent:0;mso-height-percent:0;mso-wrap-distance-left:9pt;mso-wrap-distance-top:0;mso-wrap-distance-right:9pt;mso-wrap-distance-bottom:0;mso-position-horizontal:absolute;mso-position-horizontal-relative:text;mso-position-vertical:absolute;mso-position-vertical-relative:text;mso-width-percent:0;mso-height-percent:0;mso-width-relative:page;mso-height-relative:page;v-text-anchor:top" o:gfxdata="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" filled="f" stroked="f">
                       <v:textbox>
                         <w:txbxContent>
                           <w:p>
@@ -617,7 +617,7 @@
         </w:tc>
         <w:tc>
           <w:tcPr>
-            <w:tcW w:w="2417" w:type="dxa"/>
+            <w:tcW w:w="2545" w:type="dxa"/>
             <w:gridSpan w:val="2"/>
             <w:tcBorders>
               <w:top w:val="nil"/>
@@ -800,7 +800,7 @@
         </w:tc>
         <w:tc>
           <w:tcPr>
-            <w:tcW w:w="2417" w:type="dxa"/>
+            <w:tcW w:w="2545" w:type="dxa"/>
             <w:gridSpan w:val="2"/>
             <w:tcBorders>
               <w:top w:val="nil"/>
@@ -983,7 +983,7 @@
         </w:tc>
         <w:tc>
           <w:tcPr>
-            <w:tcW w:w="2417" w:type="dxa"/>
+            <w:tcW w:w="2545" w:type="dxa"/>
             <w:gridSpan w:val="2"/>
             <w:tcBorders>
               <w:top w:val="nil"/>
@@ -1175,7 +1175,7 @@
         </w:tc>
         <w:tc>
           <w:tcPr>
-            <w:tcW w:w="2417" w:type="dxa"/>
+            <w:tcW w:w="2545" w:type="dxa"/>
             <w:gridSpan w:val="2"/>
             <w:tcBorders>
               <w:top w:val="nil"/>
@@ -1225,7 +1225,7 @@
         </w:trPr>
         <w:tc>
           <w:tcPr>
-            <w:tcW w:w="10595" w:type="dxa"/>
+            <w:tcW w:w="10723" w:type="dxa"/>
             <w:gridSpan w:val="10"/>
             <w:tcBorders>
               <w:top w:val="nil"/>
@@ -1375,7 +1375,7 @@
         </w:tc>
         <w:tc>
           <w:tcPr>
-            <w:tcW w:w="5340" w:type="dxa"/>
+            <w:tcW w:w="5468" w:type="dxa"/>
             <w:gridSpan w:val="5"/>
             <w:tcBorders>
               <w:top w:val="nil"/>
@@ -1601,7 +1601,7 @@
         </w:tc>
         <w:tc>
           <w:tcPr>
-            <w:tcW w:w="2417" w:type="dxa"/>
+            <w:tcW w:w="2545" w:type="dxa"/>
             <w:gridSpan w:val="2"/>
             <w:tcBorders>
               <w:top w:val="nil"/>
@@ -1791,7 +1791,7 @@
         </w:tc>
         <w:tc>
           <w:tcPr>
-            <w:tcW w:w="2417" w:type="dxa"/>
+            <w:tcW w:w="2545" w:type="dxa"/>
             <w:gridSpan w:val="2"/>
             <w:tcBorders>
               <w:top w:val="nil"/>
@@ -1912,7 +1912,7 @@
         </w:tc>
         <w:tc>
           <w:tcPr>
-            <w:tcW w:w="2417" w:type="dxa"/>
+            <w:tcW w:w="2545" w:type="dxa"/>
             <w:gridSpan w:val="2"/>
             <w:tcBorders>
               <w:top w:val="single" w:sz="4" w:space="0" w:color="auto"/>
@@ -2169,7 +2169,7 @@
         </w:tc>
         <w:tc>
           <w:tcPr>
-            <w:tcW w:w="2417" w:type="dxa"/>
+            <w:tcW w:w="2545" w:type="dxa"/>
             <w:gridSpan w:val="2"/>
             <w:tcBorders>
               <w:top w:val="nil"/>
@@ -2357,7 +2357,7 @@
         </w:tc>
         <w:tc>
           <w:tcPr>
-            <w:tcW w:w="2417" w:type="dxa"/>
+            <w:tcW w:w="2545" w:type="dxa"/>
             <w:gridSpan w:val="2"/>
             <w:tcBorders>
               <w:top w:val="nil"/>
@@ -2514,7 +2514,7 @@
         </w:tc>
         <w:tc>
           <w:tcPr>
-            <w:tcW w:w="796" w:type="dxa"/>
+            <w:tcW w:w="1039" w:type="dxa"/>
             <w:tcBorders>
               <w:top w:val="nil"/>
               <w:left w:val="nil"/>
@@ -2542,7 +2542,7 @@
         </w:tc>
         <w:tc>
           <w:tcPr>
-            <w:tcW w:w="1623" w:type="dxa"/>
+            <w:tcW w:w="1506" w:type="dxa"/>
             <w:tcBorders>
               <w:top w:val="nil"/>
               <w:right w:val="single" w:sz="4" w:space="0" w:color="auto"/>
@@ -2713,7 +2713,7 @@
         </w:tc>
         <w:tc>
           <w:tcPr>
-            <w:tcW w:w="796" w:type="dxa"/>
+            <w:tcW w:w="1039" w:type="dxa"/>
             <w:tcBorders>
               <w:top w:val="nil"/>
               <w:left w:val="nil"/>
@@ -2741,7 +2741,7 @@
         </w:tc>
         <w:tc>
           <w:tcPr>
-            <w:tcW w:w="1623" w:type="dxa"/>
+            <w:tcW w:w="1506" w:type="dxa"/>
             <w:tcBorders>
               <w:top w:val="nil"/>
               <w:right w:val="single" w:sz="4" w:space="0" w:color="auto"/>
@@ -2787,7 +2787,26 @@
                 <w:sz w:val="20"/>
                 <w:szCs w:val="20"/>
               </w:rPr>
-              <w:t>{biayaTrans}</w:t>
+              <w:t>{</w:t>
+            </w:r>
+            <w:proofErr w:type="spellStart"/>
+            <w:r>
+              <w:rPr>
+                <w:rFonts w:ascii="Arial" w:hAnsi="Arial" w:cs="Arial"/>
+                <w:sz w:val="20"/>
+                <w:szCs w:val="20"/>
+              </w:rPr>
+              <w:t>biayaTrans</w:t>
+            </w:r>
+            <w:proofErr w:type="spellEnd"/>
+            <w:proofErr w:type="gramStart"/>
+            <w:r>
+              <w:rPr>
+                <w:rFonts w:ascii="Arial" w:hAnsi="Arial" w:cs="Arial"/>
+                <w:sz w:val="20"/>
+                <w:szCs w:val="20"/>
+              </w:rPr>
+              <w:t>}</w:t>
             </w:r>
             <w:r>
               <w:rPr>
@@ -2798,6 +2817,7 @@
               </w:rPr>
               <w:t>,-</w:t>
             </w:r>
+            <w:proofErr w:type="gramEnd"/>
             <w:r>
               <w:rPr>
                 <w:rFonts w:ascii="Arial" w:hAnsi="Arial" w:cs="Arial"/>
@@ -2915,7 +2935,7 @@
         </w:tc>
         <w:tc>
           <w:tcPr>
-            <w:tcW w:w="796" w:type="dxa"/>
+            <w:tcW w:w="1039" w:type="dxa"/>
             <w:tcBorders>
               <w:top w:val="nil"/>
               <w:left w:val="nil"/>
@@ -2944,7 +2964,7 @@
         </w:tc>
         <w:tc>
           <w:tcPr>
-            <w:tcW w:w="1623" w:type="dxa"/>
+            <w:tcW w:w="1506" w:type="dxa"/>
             <w:tcBorders>
               <w:top w:val="nil"/>
               <w:right w:val="single" w:sz="4" w:space="0" w:color="auto"/>
@@ -2991,7 +3011,26 @@
                 <w:sz w:val="20"/>
                 <w:szCs w:val="20"/>
               </w:rPr>
-              <w:t>{biayaPeng}</w:t>
+              <w:t>{</w:t>
+            </w:r>
+            <w:proofErr w:type="spellStart"/>
+            <w:r>
+              <w:rPr>
+                <w:rFonts w:ascii="Arial" w:hAnsi="Arial" w:cs="Arial"/>
+                <w:sz w:val="20"/>
+                <w:szCs w:val="20"/>
+              </w:rPr>
+              <w:t>biayaPeng</w:t>
+            </w:r>
+            <w:proofErr w:type="spellEnd"/>
+            <w:proofErr w:type="gramStart"/>
+            <w:r>
+              <w:rPr>
+                <w:rFonts w:ascii="Arial" w:hAnsi="Arial" w:cs="Arial"/>
+                <w:sz w:val="20"/>
+                <w:szCs w:val="20"/>
+              </w:rPr>
+              <w:t>}</w:t>
             </w:r>
             <w:r>
               <w:rPr>
@@ -3002,6 +3041,7 @@
               </w:rPr>
               <w:t>,-</w:t>
             </w:r>
+            <w:proofErr w:type="gramEnd"/>
             <w:r>
               <w:rPr>
                 <w:rFonts w:ascii="Arial" w:hAnsi="Arial" w:cs="Arial"/>
@@ -3120,7 +3160,7 @@
         </w:tc>
         <w:tc>
           <w:tcPr>
-            <w:tcW w:w="796" w:type="dxa"/>
+            <w:tcW w:w="1039" w:type="dxa"/>
             <w:tcBorders>
               <w:top w:val="nil"/>
               <w:left w:val="nil"/>
@@ -3166,7 +3206,7 @@
         </w:tc>
         <w:tc>
           <w:tcPr>
-            <w:tcW w:w="1623" w:type="dxa"/>
+            <w:tcW w:w="1506" w:type="dxa"/>
             <w:tcBorders>
               <w:top w:val="nil"/>
               <w:right w:val="single" w:sz="4" w:space="0" w:color="auto"/>
@@ -3283,7 +3323,7 @@
         </w:tc>
         <w:tc>
           <w:tcPr>
-            <w:tcW w:w="796" w:type="dxa"/>
+            <w:tcW w:w="1039" w:type="dxa"/>
             <w:tcBorders>
               <w:top w:val="nil"/>
               <w:left w:val="nil"/>
@@ -3304,7 +3344,7 @@
         </w:tc>
         <w:tc>
           <w:tcPr>
-            <w:tcW w:w="1623" w:type="dxa"/>
+            <w:tcW w:w="1506" w:type="dxa"/>
             <w:tcBorders>
               <w:top w:val="nil"/>
               <w:right w:val="single" w:sz="4" w:space="0" w:color="auto"/>
@@ -3395,7 +3435,7 @@
         </w:tc>
         <w:tc>
           <w:tcPr>
-            <w:tcW w:w="2417" w:type="dxa"/>
+            <w:tcW w:w="2545" w:type="dxa"/>
             <w:gridSpan w:val="2"/>
             <w:tcBorders>
               <w:top w:val="nil"/>
@@ -3483,7 +3523,7 @@
         </w:tc>
         <w:tc>
           <w:tcPr>
-            <w:tcW w:w="796" w:type="dxa"/>
+            <w:tcW w:w="1039" w:type="dxa"/>
             <w:tcBorders>
               <w:top w:val="single" w:sz="4" w:space="0" w:color="auto"/>
               <w:left w:val="nil"/>
@@ -3513,7 +3553,7 @@
         </w:tc>
         <w:tc>
           <w:tcPr>
-            <w:tcW w:w="1623" w:type="dxa"/>
+            <w:tcW w:w="1506" w:type="dxa"/>
             <w:tcBorders>
               <w:top w:val="single" w:sz="4" w:space="0" w:color="auto"/>
               <w:bottom w:val="single" w:sz="4" w:space="0" w:color="auto"/>
@@ -3648,7 +3688,7 @@
         </w:tc>
         <w:tc>
           <w:tcPr>
-            <w:tcW w:w="796" w:type="dxa"/>
+            <w:tcW w:w="1039" w:type="dxa"/>
             <w:tcBorders>
               <w:top w:val="single" w:sz="4" w:space="0" w:color="auto"/>
               <w:left w:val="nil"/>
@@ -3681,7 +3721,7 @@
         </w:tc>
         <w:tc>
           <w:tcPr>
-            <w:tcW w:w="1623" w:type="dxa"/>
+            <w:tcW w:w="1506" w:type="dxa"/>
             <w:tcBorders>
               <w:top w:val="single" w:sz="4" w:space="0" w:color="auto"/>
               <w:bottom w:val="single" w:sz="4" w:space="0" w:color="auto"/>
@@ -3882,7 +3922,7 @@
         </w:tc>
         <w:tc>
           <w:tcPr>
-            <w:tcW w:w="2417" w:type="dxa"/>
+            <w:tcW w:w="2545" w:type="dxa"/>
             <w:gridSpan w:val="2"/>
             <w:tcBorders>
               <w:top w:val="nil"/>
@@ -4065,7 +4105,7 @@
         </w:tc>
         <w:tc>
           <w:tcPr>
-            <w:tcW w:w="4161" w:type="dxa"/>
+            <w:tcW w:w="4289" w:type="dxa"/>
             <w:gridSpan w:val="3"/>
             <w:tcBorders>
               <w:top w:val="nil"/>
@@ -4281,8 +4321,8 @@
         </w:tc>
         <w:tc>
           <w:tcPr>
-            <w:tcW w:w="2417" w:type="dxa"/>
-            <w:gridSpan w:val="2"/>
+            <w:tcW w:w="4289" w:type="dxa"/>
+            <w:gridSpan w:val="3"/>
             <w:tcBorders>
               <w:top w:val="nil"/>
               <w:left w:val="nil"/>
@@ -4296,66 +4336,36 @@
             <w:pPr>
               <w:rPr>
                 <w:rFonts w:ascii="Arial" w:hAnsi="Arial" w:cs="Arial"/>
-                <w:sz w:val="20"/>
-                <w:szCs w:val="20"/>
-              </w:rPr>
-            </w:pPr>
-            <w:r>
-              <w:rPr>
-                <w:rFonts w:ascii="Arial" w:hAnsi="Arial" w:cs="Arial"/>
-                <w:sz w:val="20"/>
-                <w:szCs w:val="20"/>
-              </w:rPr>
-              <w:t>Bandung, {</w:t>
-            </w:r>
-            <w:proofErr w:type="spellStart"/>
-            <w:r>
-              <w:rPr>
-                <w:rFonts w:ascii="Arial" w:hAnsi="Arial" w:cs="Arial"/>
-                <w:sz w:val="20"/>
-                <w:szCs w:val="20"/>
-              </w:rPr>
-              <w:t>tgl</w:t>
-            </w:r>
-            <w:r>
-              <w:rPr>
-                <w:rFonts w:ascii="Arial" w:hAnsi="Arial" w:cs="Arial"/>
-                <w:sz w:val="20"/>
-                <w:szCs w:val="20"/>
-              </w:rPr>
-              <w:t>Kembali</w:t>
-            </w:r>
-            <w:proofErr w:type="spellEnd"/>
-            <w:r>
-              <w:rPr>
-                <w:rFonts w:ascii="Arial" w:hAnsi="Arial" w:cs="Arial"/>
-                <w:sz w:val="20"/>
-                <w:szCs w:val="20"/>
-              </w:rPr>
-              <w:t>}</w:t>
-            </w:r>
-          </w:p>
-        </w:tc>
-        <w:tc>
-          <w:tcPr>
-            <w:tcW w:w="1744" w:type="dxa"/>
-            <w:tcBorders>
-              <w:top w:val="nil"/>
-              <w:left w:val="nil"/>
-              <w:bottom w:val="nil"/>
-              <w:right w:val="nil"/>
-            </w:tcBorders>
-            <w:noWrap/>
-            <w:vAlign w:val="bottom"/>
-          </w:tcPr>
-          <w:p>
-            <w:pPr>
-              <w:rPr>
-                <w:rFonts w:ascii="Arial" w:hAnsi="Arial" w:cs="Arial"/>
                 <w:sz w:val="16"/>
                 <w:szCs w:val="16"/>
               </w:rPr>
             </w:pPr>
+            <w:r>
+              <w:rPr>
+                <w:rFonts w:ascii="Arial" w:hAnsi="Arial" w:cs="Arial"/>
+                <w:sz w:val="20"/>
+                <w:szCs w:val="20"/>
+              </w:rPr>
+              <w:t>Bandung, {</w:t>
+            </w:r>
+            <w:proofErr w:type="spellStart"/>
+            <w:r>
+              <w:rPr>
+                <w:rFonts w:ascii="Arial" w:hAnsi="Arial" w:cs="Arial"/>
+                <w:sz w:val="20"/>
+                <w:szCs w:val="20"/>
+              </w:rPr>
+              <w:t>tglKembali</w:t>
+            </w:r>
+            <w:proofErr w:type="spellEnd"/>
+            <w:r>
+              <w:rPr>
+                <w:rFonts w:ascii="Arial" w:hAnsi="Arial" w:cs="Arial"/>
+                <w:sz w:val="20"/>
+                <w:szCs w:val="20"/>
+              </w:rPr>
+              <w:t>}</w:t>
+            </w:r>
           </w:p>
         </w:tc>
       </w:tr>
@@ -4491,7 +4501,7 @@
         </w:tc>
         <w:tc>
           <w:tcPr>
-            <w:tcW w:w="4161" w:type="dxa"/>
+            <w:tcW w:w="4289" w:type="dxa"/>
             <w:gridSpan w:val="3"/>
             <w:tcBorders>
               <w:top w:val="nil"/>
@@ -4681,7 +4691,27 @@
                 <w:sz w:val="20"/>
                 <w:szCs w:val="20"/>
               </w:rPr>
-              <w:t>{jumlahTotal}</w:t>
+              <w:t>{</w:t>
+            </w:r>
+            <w:proofErr w:type="spellStart"/>
+            <w:r>
+              <w:rPr>
+                <w:rFonts w:ascii="Arial" w:hAnsi="Arial" w:cs="Arial"/>
+                <w:noProof/>
+                <w:sz w:val="20"/>
+                <w:szCs w:val="20"/>
+              </w:rPr>
+              <w:t>jumlahTotal</w:t>
+            </w:r>
+            <w:proofErr w:type="spellEnd"/>
+            <w:r>
+              <w:rPr>
+                <w:rFonts w:ascii="Arial" w:hAnsi="Arial" w:cs="Arial"/>
+                <w:noProof/>
+                <w:sz w:val="20"/>
+                <w:szCs w:val="20"/>
+              </w:rPr>
+              <w:t>}</w:t>
             </w:r>
             <w:r>
               <w:rPr>
@@ -4792,7 +4822,7 @@
         </w:tc>
         <w:tc>
           <w:tcPr>
-            <w:tcW w:w="2417" w:type="dxa"/>
+            <w:tcW w:w="2545" w:type="dxa"/>
             <w:gridSpan w:val="2"/>
             <w:tcBorders>
               <w:top w:val="nil"/>
@@ -4850,7 +4880,27 @@
                 <w:sz w:val="20"/>
                 <w:szCs w:val="20"/>
               </w:rPr>
-              <w:t>{jumlahTotal}</w:t>
+              <w:t>{</w:t>
+            </w:r>
+            <w:proofErr w:type="spellStart"/>
+            <w:r>
+              <w:rPr>
+                <w:rFonts w:ascii="Arial" w:hAnsi="Arial" w:cs="Arial"/>
+                <w:noProof/>
+                <w:sz w:val="20"/>
+                <w:szCs w:val="20"/>
+              </w:rPr>
+              <w:t>jumlahTotal</w:t>
+            </w:r>
+            <w:proofErr w:type="spellEnd"/>
+            <w:r>
+              <w:rPr>
+                <w:rFonts w:ascii="Arial" w:hAnsi="Arial" w:cs="Arial"/>
+                <w:noProof/>
+                <w:sz w:val="20"/>
+                <w:szCs w:val="20"/>
+              </w:rPr>
+              <w:t>}</w:t>
             </w:r>
             <w:r>
               <w:rPr>
@@ -5022,7 +5072,7 @@
         </w:tc>
         <w:tc>
           <w:tcPr>
-            <w:tcW w:w="4161" w:type="dxa"/>
+            <w:tcW w:w="4289" w:type="dxa"/>
             <w:gridSpan w:val="3"/>
             <w:tcBorders>
               <w:top w:val="nil"/>
@@ -5192,7 +5242,7 @@
         </w:tc>
         <w:tc>
           <w:tcPr>
-            <w:tcW w:w="2417" w:type="dxa"/>
+            <w:tcW w:w="2545" w:type="dxa"/>
             <w:gridSpan w:val="2"/>
             <w:tcBorders>
               <w:top w:val="nil"/>
@@ -5375,7 +5425,7 @@
         </w:tc>
         <w:tc>
           <w:tcPr>
-            <w:tcW w:w="2417" w:type="dxa"/>
+            <w:tcW w:w="2545" w:type="dxa"/>
             <w:gridSpan w:val="2"/>
             <w:tcBorders>
               <w:top w:val="nil"/>
@@ -5558,7 +5608,7 @@
         </w:tc>
         <w:tc>
           <w:tcPr>
-            <w:tcW w:w="2417" w:type="dxa"/>
+            <w:tcW w:w="2545" w:type="dxa"/>
             <w:gridSpan w:val="2"/>
             <w:tcBorders>
               <w:top w:val="nil"/>
@@ -5741,7 +5791,7 @@
         </w:tc>
         <w:tc>
           <w:tcPr>
-            <w:tcW w:w="2417" w:type="dxa"/>
+            <w:tcW w:w="2545" w:type="dxa"/>
             <w:gridSpan w:val="2"/>
             <w:tcBorders>
               <w:top w:val="nil"/>
@@ -5866,7 +5916,7 @@
         </w:tc>
         <w:tc>
           <w:tcPr>
-            <w:tcW w:w="4161" w:type="dxa"/>
+            <w:tcW w:w="4289" w:type="dxa"/>
             <w:gridSpan w:val="3"/>
             <w:tcBorders>
               <w:top w:val="nil"/>
@@ -6008,7 +6058,7 @@
         </w:tc>
         <w:tc>
           <w:tcPr>
-            <w:tcW w:w="4161" w:type="dxa"/>
+            <w:tcW w:w="4289" w:type="dxa"/>
             <w:gridSpan w:val="3"/>
             <w:tcBorders>
               <w:top w:val="nil"/>
@@ -6185,7 +6235,7 @@
         </w:tc>
         <w:tc>
           <w:tcPr>
-            <w:tcW w:w="2417" w:type="dxa"/>
+            <w:tcW w:w="2545" w:type="dxa"/>
             <w:gridSpan w:val="2"/>
             <w:tcBorders>
               <w:top w:val="nil"/>
@@ -10337,6 +10387,7 @@
                 <w:szCs w:val="20"/>
               </w:rPr>
             </w:pPr>
+            <w:proofErr w:type="gramStart"/>
             <w:r>
               <w:rPr>
                 <w:rFonts w:ascii="Arial" w:hAnsi="Arial" w:cs="Arial"/>
@@ -10345,7 +10396,18 @@
                 <w:sz w:val="20"/>
                 <w:szCs w:val="20"/>
               </w:rPr>
-              <w:t xml:space="preserve">TERBILANG : </w:t>
+              <w:t>TERBILANG :</w:t>
+            </w:r>
+            <w:proofErr w:type="gramEnd"/>
+            <w:r>
+              <w:rPr>
+                <w:rFonts w:ascii="Arial" w:hAnsi="Arial" w:cs="Arial"/>
+                <w:b/>
+                <w:bCs/>
+                <w:sz w:val="20"/>
+                <w:szCs w:val="20"/>
+              </w:rPr>
+              <w:t xml:space="preserve"> </w:t>
             </w:r>
           </w:p>
         </w:tc>
@@ -16309,6 +16371,9 @@
   <wne:recipientData>
     <wne:active wne:val="1"/>
   </wne:recipientData>
+  <wne:recipientData>
+    <wne:active wne:val="1"/>
+  </wne:recipientData>
 </wne:recipients>
 </file>
 

</xml_diff>